<commit_message>
Update docent records and add ExplAI 2026, conference tracker, and ADT audit materials
- Update docent attestation docs and ExplAI 2025 CFP
- Add ExplAI 2026 CFP drafts (v1-v4), workshop logo, and CEUR paper template
- Add docent supporting scans/proofs and U_CAN paper archive
- Add conferences tracker (CSV/XLSX) and Ukrainian events list
- Add ADT audit CEUR paper submission, presentation, figures, and working files

Co-Authored-By: Claude Sonnet 5 <noreply@anthropic.com>
</commit_message>
<xml_diff>
--- a/02_docent/04_Радюк_Рішення-вченої-ради.docx
+++ b/02_docent/04_Радюк_Рішення-вченої-ради.docx
@@ -64,22 +64,24 @@
       <w:r>
         <w:rPr>
           <w:spacing w:val="-2"/>
-          <w:highlight w:val="yellow"/>
-        </w:rPr>
-        <w:t>65 осіб з 7</w:t>
-      </w:r>
-      <w:r>
-        <w:rPr>
-          <w:spacing w:val="-2"/>
-          <w:highlight w:val="yellow"/>
-          <w:lang w:val="en-US"/>
-        </w:rPr>
-        <w:t>7</w:t>
-      </w:r>
-      <w:r>
-        <w:rPr>
-          <w:spacing w:val="-2"/>
-          <w:highlight w:val="yellow"/>
+        </w:rPr>
+        <w:t>___</w:t>
+      </w:r>
+      <w:r>
+        <w:rPr>
+          <w:spacing w:val="-2"/>
+        </w:rPr>
+        <w:t xml:space="preserve"> осіб з </w:t>
+      </w:r>
+      <w:r>
+        <w:rPr>
+          <w:spacing w:val="-2"/>
+        </w:rPr>
+        <w:t>___</w:t>
+      </w:r>
+      <w:r>
+        <w:rPr>
+          <w:spacing w:val="-2"/>
         </w:rPr>
         <w:t xml:space="preserve"> членів ради.</w:t>
       </w:r>
@@ -87,69 +89,109 @@
     <w:p>
       <w:pPr>
         <w:rPr>
-          <w:spacing w:val="-2"/>
-          <w:highlight w:val="yellow"/>
-        </w:rPr>
-      </w:pPr>
-      <w:r>
-        <w:rPr>
-          <w:spacing w:val="-2"/>
-          <w:highlight w:val="yellow"/>
-        </w:rPr>
-        <w:t>Результати голосування: «за» – 60, «проти» – 0, недійсних бюлетенів – 5.</w:t>
-      </w:r>
-    </w:p>
-    <w:p>
-      <w:pPr>
-        <w:rPr>
-          <w:spacing w:val="-2"/>
-        </w:rPr>
-      </w:pPr>
-      <w:r>
-        <w:rPr>
-          <w:spacing w:val="-2"/>
-        </w:rPr>
-        <w:t xml:space="preserve">Протокол засідання </w:t>
-      </w:r>
-      <w:r>
-        <w:rPr>
-          <w:spacing w:val="-2"/>
-          <w:highlight w:val="yellow"/>
-        </w:rPr>
-        <w:t xml:space="preserve">№ </w:t>
-      </w:r>
-      <w:r>
-        <w:rPr>
-          <w:spacing w:val="-2"/>
-          <w:highlight w:val="yellow"/>
-        </w:rPr>
-        <w:t>4</w:t>
-      </w:r>
-      <w:r>
-        <w:rPr>
-          <w:spacing w:val="-2"/>
-          <w:highlight w:val="yellow"/>
+          <w:spacing w:val="-6"/>
+        </w:rPr>
+      </w:pPr>
+      <w:r>
+        <w:rPr>
+          <w:spacing w:val="-6"/>
+        </w:rPr>
+        <w:t xml:space="preserve">Результати голосування: «за» – </w:t>
+      </w:r>
+      <w:r>
+        <w:rPr>
+          <w:spacing w:val="-6"/>
+        </w:rPr>
+        <w:t>___</w:t>
+      </w:r>
+      <w:r>
+        <w:rPr>
+          <w:spacing w:val="-6"/>
+        </w:rPr>
+        <w:t xml:space="preserve">, «проти» – </w:t>
+      </w:r>
+      <w:r>
+        <w:rPr>
+          <w:spacing w:val="-6"/>
+        </w:rPr>
+        <w:t>___</w:t>
+      </w:r>
+      <w:r>
+        <w:rPr>
+          <w:spacing w:val="-6"/>
+        </w:rPr>
+        <w:t xml:space="preserve">, недійсних бюлетенів – </w:t>
+      </w:r>
+      <w:r>
+        <w:rPr>
+          <w:spacing w:val="-6"/>
+        </w:rPr>
+        <w:t>___</w:t>
+      </w:r>
+      <w:r>
+        <w:rPr>
+          <w:spacing w:val="-6"/>
+        </w:rPr>
+        <w:t>.</w:t>
+      </w:r>
+    </w:p>
+    <w:p>
+      <w:pPr>
+        <w:rPr>
+          <w:spacing w:val="-2"/>
+        </w:rPr>
+      </w:pPr>
+      <w:r>
+        <w:rPr>
+          <w:spacing w:val="-2"/>
+        </w:rPr>
+        <w:t xml:space="preserve">Протокол засідання № </w:t>
+      </w:r>
+      <w:r>
+        <w:rPr>
+          <w:spacing w:val="-2"/>
+        </w:rPr>
+        <w:t>___</w:t>
+      </w:r>
+      <w:r>
+        <w:rPr>
+          <w:spacing w:val="-2"/>
         </w:rPr>
         <w:t xml:space="preserve">  від </w:t>
       </w:r>
       <w:r>
         <w:rPr>
           <w:spacing w:val="-2"/>
-          <w:highlight w:val="yellow"/>
-        </w:rPr>
-        <w:t xml:space="preserve">24 вересня </w:t>
-      </w:r>
-      <w:r>
-        <w:rPr>
-          <w:spacing w:val="-2"/>
-          <w:highlight w:val="yellow"/>
+        </w:rPr>
+        <w:t>«___»</w:t>
+      </w:r>
+      <w:r>
+        <w:rPr>
+          <w:spacing w:val="-2"/>
+        </w:rPr>
+        <w:t xml:space="preserve"> </w:t>
+      </w:r>
+      <w:r>
+        <w:rPr>
+          <w:spacing w:val="-2"/>
+        </w:rPr>
+        <w:t>вересня</w:t>
+      </w:r>
+      <w:r>
+        <w:rPr>
+          <w:spacing w:val="-2"/>
+        </w:rPr>
+        <w:t xml:space="preserve"> </w:t>
+      </w:r>
+      <w:r>
+        <w:rPr>
+          <w:spacing w:val="-2"/>
         </w:rPr>
         <w:t>2026 року</w:t>
       </w:r>
       <w:r>
         <w:rPr>
           <w:spacing w:val="-2"/>
-          <w:highlight w:val="yellow"/>
         </w:rPr>
         <w:t>.</w:t>
       </w:r>
@@ -692,131 +734,11 @@
         </w:rPr>
         <w:t>) </w:t>
       </w:r>
-      <w:proofErr w:type="spellStart"/>
-      <w:r>
-        <w:rPr>
-          <w:spacing w:val="-2"/>
-        </w:rPr>
-        <w:t>Conducting</w:t>
-      </w:r>
-      <w:proofErr w:type="spellEnd"/>
-      <w:r>
-        <w:rPr>
-          <w:spacing w:val="-2"/>
-        </w:rPr>
-        <w:t xml:space="preserve"> </w:t>
-      </w:r>
-      <w:proofErr w:type="spellStart"/>
-      <w:r>
-        <w:rPr>
-          <w:spacing w:val="-2"/>
-        </w:rPr>
-        <w:t>Experiments</w:t>
-      </w:r>
-      <w:proofErr w:type="spellEnd"/>
-      <w:r>
-        <w:rPr>
-          <w:spacing w:val="-2"/>
-        </w:rPr>
-        <w:t xml:space="preserve"> </w:t>
-      </w:r>
-      <w:proofErr w:type="spellStart"/>
-      <w:r>
-        <w:rPr>
-          <w:spacing w:val="-2"/>
-        </w:rPr>
-        <w:t>and</w:t>
-      </w:r>
-      <w:proofErr w:type="spellEnd"/>
-      <w:r>
-        <w:rPr>
-          <w:spacing w:val="-2"/>
-        </w:rPr>
-        <w:t xml:space="preserve"> </w:t>
-      </w:r>
-      <w:proofErr w:type="spellStart"/>
-      <w:r>
-        <w:rPr>
-          <w:spacing w:val="-2"/>
-        </w:rPr>
-        <w:t>Processing</w:t>
-      </w:r>
-      <w:proofErr w:type="spellEnd"/>
-      <w:r>
-        <w:rPr>
-          <w:spacing w:val="-2"/>
-        </w:rPr>
-        <w:t xml:space="preserve"> </w:t>
-      </w:r>
-      <w:proofErr w:type="spellStart"/>
-      <w:r>
-        <w:rPr>
-          <w:spacing w:val="-2"/>
-        </w:rPr>
-        <w:t>the</w:t>
-      </w:r>
-      <w:proofErr w:type="spellEnd"/>
-      <w:r>
-        <w:rPr>
-          <w:spacing w:val="-2"/>
-        </w:rPr>
-        <w:t xml:space="preserve"> </w:t>
-      </w:r>
-      <w:proofErr w:type="spellStart"/>
-      <w:r>
-        <w:rPr>
-          <w:spacing w:val="-2"/>
-        </w:rPr>
-        <w:t>Results</w:t>
-      </w:r>
-      <w:proofErr w:type="spellEnd"/>
-      <w:r>
-        <w:rPr>
-          <w:spacing w:val="-2"/>
-        </w:rPr>
-        <w:t xml:space="preserve"> </w:t>
-      </w:r>
-      <w:proofErr w:type="spellStart"/>
-      <w:r>
-        <w:rPr>
-          <w:spacing w:val="-2"/>
-        </w:rPr>
-        <w:t>of</w:t>
-      </w:r>
-      <w:proofErr w:type="spellEnd"/>
-      <w:r>
-        <w:rPr>
-          <w:spacing w:val="-2"/>
-        </w:rPr>
-        <w:t xml:space="preserve"> </w:t>
-      </w:r>
-      <w:proofErr w:type="spellStart"/>
-      <w:r>
-        <w:rPr>
-          <w:spacing w:val="-2"/>
-        </w:rPr>
-        <w:t>Scientific</w:t>
-      </w:r>
-      <w:proofErr w:type="spellEnd"/>
-      <w:r>
-        <w:rPr>
-          <w:spacing w:val="-2"/>
-        </w:rPr>
-        <w:t xml:space="preserve"> </w:t>
-      </w:r>
-      <w:proofErr w:type="spellStart"/>
-      <w:r>
-        <w:rPr>
-          <w:spacing w:val="-2"/>
-        </w:rPr>
-        <w:t>Research</w:t>
-      </w:r>
-      <w:proofErr w:type="spellEnd"/>
-      <w:r>
-        <w:rPr>
-          <w:spacing w:val="-2"/>
-        </w:rPr>
-        <w:t xml:space="preserve"> («Проведення експериментів та опрацювання результатів наукових досліджень») – 32 години лекцій;</w:t>
+      <w:r>
+        <w:rPr>
+          <w:spacing w:val="-2"/>
+        </w:rPr>
+        <w:t>Conducting Experiments and Processing the Results of Scientific Research («Проведення експериментів та опрацювання результатів наукових досліджень») – 32 години лекцій;</w:t>
       </w:r>
       <w:r>
         <w:rPr>
@@ -1165,21 +1087,7 @@
         <w:rPr>
           <w:spacing w:val="-2"/>
         </w:rPr>
-        <w:t xml:space="preserve">Наукові інтереси здобувача: </w:t>
-      </w:r>
-      <w:proofErr w:type="spellStart"/>
-      <w:r>
-        <w:rPr>
-          <w:spacing w:val="-2"/>
-        </w:rPr>
-        <w:t>інтерпретовне</w:t>
-      </w:r>
-      <w:proofErr w:type="spellEnd"/>
-      <w:r>
-        <w:rPr>
-          <w:spacing w:val="-2"/>
-        </w:rPr>
-        <w:t xml:space="preserve"> (пояснюване) глибоке навчання, комп’ютерний зір, аналіз медичних зображень, інтелектуальний аналіз даних.</w:t>
+        <w:t>Наукові інтереси здобувача: інтерпретовне (пояснюване) глибоке навчання, комп’ютерний зір, аналіз медичних зображень, інтелектуальний аналіз даних.</w:t>
       </w:r>
     </w:p>
     <w:p>
@@ -1243,175 +1151,7 @@
         <w:rPr>
           <w:spacing w:val="-2"/>
         </w:rPr>
-        <w:t xml:space="preserve">Здобувач є виконавцем проєкту програми Європейського Союзу «Горизонт Європа» № 101148374 «U_CAN: </w:t>
-      </w:r>
-      <w:proofErr w:type="spellStart"/>
-      <w:r>
-        <w:rPr>
-          <w:spacing w:val="-2"/>
-        </w:rPr>
-        <w:t>Ukraine</w:t>
-      </w:r>
-      <w:proofErr w:type="spellEnd"/>
-      <w:r>
-        <w:rPr>
-          <w:spacing w:val="-2"/>
-        </w:rPr>
-        <w:t xml:space="preserve"> </w:t>
-      </w:r>
-      <w:proofErr w:type="spellStart"/>
-      <w:r>
-        <w:rPr>
-          <w:spacing w:val="-2"/>
-        </w:rPr>
-        <w:t>towards</w:t>
-      </w:r>
-      <w:proofErr w:type="spellEnd"/>
-      <w:r>
-        <w:rPr>
-          <w:spacing w:val="-2"/>
-        </w:rPr>
-        <w:t xml:space="preserve"> </w:t>
-      </w:r>
-      <w:proofErr w:type="spellStart"/>
-      <w:r>
-        <w:rPr>
-          <w:spacing w:val="-2"/>
-        </w:rPr>
-        <w:t>Carbon</w:t>
-      </w:r>
-      <w:proofErr w:type="spellEnd"/>
-      <w:r>
-        <w:rPr>
-          <w:spacing w:val="-2"/>
-        </w:rPr>
-        <w:t xml:space="preserve"> </w:t>
-      </w:r>
-      <w:proofErr w:type="spellStart"/>
-      <w:r>
-        <w:rPr>
-          <w:spacing w:val="-2"/>
-        </w:rPr>
-        <w:t>Neutrality</w:t>
-      </w:r>
-      <w:proofErr w:type="spellEnd"/>
-      <w:r>
-        <w:rPr>
-          <w:spacing w:val="-2"/>
-        </w:rPr>
-        <w:t xml:space="preserve">» (HORIZON-MISS-2023-CIT-02-01). Здійснює рецензування наукових праць у виданнях, що індексуються у наукометричних базах </w:t>
-      </w:r>
-      <w:proofErr w:type="spellStart"/>
-      <w:r>
-        <w:rPr>
-          <w:spacing w:val="-2"/>
-        </w:rPr>
-        <w:t>Scopus</w:t>
-      </w:r>
-      <w:proofErr w:type="spellEnd"/>
-      <w:r>
-        <w:rPr>
-          <w:spacing w:val="-2"/>
-        </w:rPr>
-        <w:t xml:space="preserve"> та </w:t>
-      </w:r>
-      <w:proofErr w:type="spellStart"/>
-      <w:r>
-        <w:rPr>
-          <w:spacing w:val="-2"/>
-        </w:rPr>
-        <w:t>Web</w:t>
-      </w:r>
-      <w:proofErr w:type="spellEnd"/>
-      <w:r>
-        <w:rPr>
-          <w:spacing w:val="-2"/>
-        </w:rPr>
-        <w:t xml:space="preserve"> </w:t>
-      </w:r>
-      <w:proofErr w:type="spellStart"/>
-      <w:r>
-        <w:rPr>
-          <w:spacing w:val="-2"/>
-        </w:rPr>
-        <w:t>of</w:t>
-      </w:r>
-      <w:proofErr w:type="spellEnd"/>
-      <w:r>
-        <w:rPr>
-          <w:spacing w:val="-2"/>
-        </w:rPr>
-        <w:t xml:space="preserve"> </w:t>
-      </w:r>
-      <w:proofErr w:type="spellStart"/>
-      <w:r>
-        <w:rPr>
-          <w:spacing w:val="-2"/>
-        </w:rPr>
-        <w:t>Science</w:t>
-      </w:r>
-      <w:proofErr w:type="spellEnd"/>
-      <w:r>
-        <w:rPr>
-          <w:spacing w:val="-2"/>
-        </w:rPr>
-        <w:t xml:space="preserve"> (профіль рецензента </w:t>
-      </w:r>
-      <w:proofErr w:type="spellStart"/>
-      <w:r>
-        <w:rPr>
-          <w:spacing w:val="-2"/>
-        </w:rPr>
-        <w:t>Web</w:t>
-      </w:r>
-      <w:proofErr w:type="spellEnd"/>
-      <w:r>
-        <w:rPr>
-          <w:spacing w:val="-2"/>
-        </w:rPr>
-        <w:t xml:space="preserve"> </w:t>
-      </w:r>
-      <w:proofErr w:type="spellStart"/>
-      <w:r>
-        <w:rPr>
-          <w:spacing w:val="-2"/>
-        </w:rPr>
-        <w:t>of</w:t>
-      </w:r>
-      <w:proofErr w:type="spellEnd"/>
-      <w:r>
-        <w:rPr>
-          <w:spacing w:val="-2"/>
-        </w:rPr>
-        <w:t xml:space="preserve"> </w:t>
-      </w:r>
-      <w:proofErr w:type="spellStart"/>
-      <w:r>
-        <w:rPr>
-          <w:spacing w:val="-2"/>
-        </w:rPr>
-        <w:t>Science</w:t>
-      </w:r>
-      <w:proofErr w:type="spellEnd"/>
-      <w:r>
-        <w:rPr>
-          <w:spacing w:val="-2"/>
-        </w:rPr>
-        <w:t xml:space="preserve">, </w:t>
-      </w:r>
-      <w:proofErr w:type="spellStart"/>
-      <w:r>
-        <w:rPr>
-          <w:spacing w:val="-2"/>
-        </w:rPr>
-        <w:t>ResearcherID</w:t>
-      </w:r>
-      <w:proofErr w:type="spellEnd"/>
-      <w:r>
-        <w:rPr>
-          <w:spacing w:val="-2"/>
-        </w:rPr>
-        <w:t>: AAA-9727-2021).</w:t>
+        <w:t>Здобувач є виконавцем проєкту програми Європейського Союзу «Горизонт Європа» № 101148374 «U_CAN: Ukraine towards Carbon Neutrality» (HORIZON-MISS-2023-CIT-02-01). Здійснює рецензування наукових праць у виданнях, що індексуються у наукометричних базах Scopus та Web of Science (профіль рецензента Web of Science, ResearcherID: AAA-9727-2021).</w:t>
       </w:r>
     </w:p>
     <w:p>
@@ -1430,266 +1170,14 @@
         <w:rPr>
           <w:spacing w:val="-2"/>
         </w:rPr>
-        <w:t>Здобувач з 06 березня по 14 квітня 2023 року пройшов міжнародне науково-педагогічне стажування у країні Європейського Союзу за програмою «</w:t>
-      </w:r>
-      <w:proofErr w:type="spellStart"/>
-      <w:r>
-        <w:rPr>
-          <w:spacing w:val="-2"/>
-        </w:rPr>
-        <w:t>Teaching</w:t>
-      </w:r>
-      <w:proofErr w:type="spellEnd"/>
-      <w:r>
-        <w:rPr>
-          <w:spacing w:val="-2"/>
-        </w:rPr>
-        <w:t xml:space="preserve"> </w:t>
-      </w:r>
-      <w:proofErr w:type="spellStart"/>
-      <w:r>
-        <w:rPr>
-          <w:spacing w:val="-2"/>
-        </w:rPr>
-        <w:t>and</w:t>
-      </w:r>
-      <w:proofErr w:type="spellEnd"/>
-      <w:r>
-        <w:rPr>
-          <w:spacing w:val="-2"/>
-        </w:rPr>
-        <w:t xml:space="preserve"> </w:t>
-      </w:r>
-      <w:proofErr w:type="spellStart"/>
-      <w:r>
-        <w:rPr>
-          <w:spacing w:val="-2"/>
-        </w:rPr>
-        <w:t>research</w:t>
-      </w:r>
-      <w:proofErr w:type="spellEnd"/>
-      <w:r>
-        <w:rPr>
-          <w:spacing w:val="-2"/>
-        </w:rPr>
-        <w:t xml:space="preserve"> </w:t>
-      </w:r>
-      <w:proofErr w:type="spellStart"/>
-      <w:r>
-        <w:rPr>
-          <w:spacing w:val="-2"/>
-        </w:rPr>
-        <w:t>in</w:t>
-      </w:r>
-      <w:proofErr w:type="spellEnd"/>
-      <w:r>
-        <w:rPr>
-          <w:spacing w:val="-2"/>
-        </w:rPr>
-        <w:t xml:space="preserve"> a </w:t>
-      </w:r>
-      <w:proofErr w:type="spellStart"/>
-      <w:r>
-        <w:rPr>
-          <w:spacing w:val="-2"/>
-        </w:rPr>
-        <w:t>contemporary</w:t>
-      </w:r>
-      <w:proofErr w:type="spellEnd"/>
-      <w:r>
-        <w:rPr>
-          <w:spacing w:val="-2"/>
-        </w:rPr>
-        <w:t xml:space="preserve"> </w:t>
-      </w:r>
-      <w:proofErr w:type="spellStart"/>
-      <w:r>
-        <w:rPr>
-          <w:spacing w:val="-2"/>
-        </w:rPr>
-        <w:t>university</w:t>
-      </w:r>
-      <w:proofErr w:type="spellEnd"/>
-      <w:r>
-        <w:rPr>
-          <w:spacing w:val="-2"/>
-        </w:rPr>
-        <w:t xml:space="preserve">: </w:t>
-      </w:r>
-      <w:proofErr w:type="spellStart"/>
-      <w:r>
-        <w:rPr>
-          <w:spacing w:val="-2"/>
-        </w:rPr>
-        <w:t>challenges</w:t>
-      </w:r>
-      <w:proofErr w:type="spellEnd"/>
-      <w:r>
-        <w:rPr>
-          <w:spacing w:val="-2"/>
-        </w:rPr>
-        <w:t xml:space="preserve">, </w:t>
-      </w:r>
-      <w:proofErr w:type="spellStart"/>
-      <w:r>
-        <w:rPr>
-          <w:spacing w:val="-2"/>
-        </w:rPr>
-        <w:t>solutions</w:t>
-      </w:r>
-      <w:proofErr w:type="spellEnd"/>
-      <w:r>
-        <w:rPr>
-          <w:spacing w:val="-2"/>
-        </w:rPr>
-        <w:t xml:space="preserve">, </w:t>
-      </w:r>
-      <w:proofErr w:type="spellStart"/>
-      <w:r>
-        <w:rPr>
-          <w:spacing w:val="-2"/>
-        </w:rPr>
-        <w:t>and</w:t>
-      </w:r>
-      <w:proofErr w:type="spellEnd"/>
-      <w:r>
-        <w:rPr>
-          <w:spacing w:val="-2"/>
-        </w:rPr>
-        <w:t xml:space="preserve"> </w:t>
-      </w:r>
-      <w:proofErr w:type="spellStart"/>
-      <w:r>
-        <w:rPr>
-          <w:spacing w:val="-2"/>
-        </w:rPr>
-        <w:t>perspectives</w:t>
-      </w:r>
-      <w:proofErr w:type="spellEnd"/>
-      <w:r>
-        <w:rPr>
-          <w:spacing w:val="-2"/>
-        </w:rPr>
-        <w:t xml:space="preserve">» на базі </w:t>
-      </w:r>
-      <w:proofErr w:type="spellStart"/>
-      <w:r>
-        <w:rPr>
-          <w:spacing w:val="-2"/>
-        </w:rPr>
-        <w:t>Faculty</w:t>
-      </w:r>
-      <w:proofErr w:type="spellEnd"/>
-      <w:r>
-        <w:rPr>
-          <w:spacing w:val="-2"/>
-        </w:rPr>
-        <w:t xml:space="preserve"> </w:t>
-      </w:r>
-      <w:proofErr w:type="spellStart"/>
-      <w:r>
-        <w:rPr>
-          <w:spacing w:val="-2"/>
-        </w:rPr>
-        <w:t>of</w:t>
-      </w:r>
-      <w:proofErr w:type="spellEnd"/>
-      <w:r>
-        <w:rPr>
-          <w:spacing w:val="-2"/>
-        </w:rPr>
-        <w:t xml:space="preserve"> </w:t>
-      </w:r>
-      <w:proofErr w:type="spellStart"/>
-      <w:r>
-        <w:rPr>
-          <w:spacing w:val="-2"/>
-        </w:rPr>
-        <w:t>Education</w:t>
-      </w:r>
-      <w:proofErr w:type="spellEnd"/>
-      <w:r>
-        <w:rPr>
-          <w:spacing w:val="-2"/>
-        </w:rPr>
-        <w:t xml:space="preserve">, </w:t>
-      </w:r>
-      <w:proofErr w:type="spellStart"/>
-      <w:r>
-        <w:rPr>
-          <w:spacing w:val="-2"/>
-        </w:rPr>
-        <w:t>University</w:t>
-      </w:r>
-      <w:proofErr w:type="spellEnd"/>
-      <w:r>
-        <w:rPr>
-          <w:spacing w:val="-2"/>
-        </w:rPr>
-        <w:t xml:space="preserve"> </w:t>
-      </w:r>
-      <w:proofErr w:type="spellStart"/>
-      <w:r>
-        <w:rPr>
-          <w:spacing w:val="-2"/>
-        </w:rPr>
-        <w:t>of</w:t>
-      </w:r>
-      <w:proofErr w:type="spellEnd"/>
-      <w:r>
-        <w:rPr>
-          <w:spacing w:val="-2"/>
-        </w:rPr>
-        <w:t xml:space="preserve"> </w:t>
-      </w:r>
-      <w:proofErr w:type="spellStart"/>
-      <w:r>
-        <w:rPr>
-          <w:spacing w:val="-2"/>
-        </w:rPr>
-        <w:t>Białystok</w:t>
-      </w:r>
-      <w:proofErr w:type="spellEnd"/>
-      <w:r>
-        <w:rPr>
-          <w:spacing w:val="-2"/>
-        </w:rPr>
-        <w:t xml:space="preserve"> (м. Білосток, Республіка Польща). Програма стажування становила 180 навчальних годин (6 кредитів ECTS). Індивідуальну програму </w:t>
+        <w:t xml:space="preserve">Здобувач з 06 березня по 14 квітня 2023 року пройшов міжнародне науково-педагогічне стажування у країні Європейського Союзу за програмою «Teaching and research in a contemporary university: challenges, solutions, and perspectives» на базі Faculty of Education, University of Białystok (м. Білосток, Республіка Польща). Програма стажування становила 180 навчальних годин (6 кредитів ECTS). Індивідуальну програму </w:t>
       </w:r>
       <w:r>
         <w:rPr>
           <w:spacing w:val="-2"/>
         </w:rPr>
         <w:lastRenderedPageBreak/>
-        <w:t xml:space="preserve">міжнародного стажування виконано в повному обсязі. Отримано </w:t>
-      </w:r>
-      <w:proofErr w:type="spellStart"/>
-      <w:r>
-        <w:rPr>
-          <w:spacing w:val="-2"/>
-        </w:rPr>
-        <w:t>Certificate</w:t>
-      </w:r>
-      <w:proofErr w:type="spellEnd"/>
-      <w:r>
-        <w:rPr>
-          <w:spacing w:val="-2"/>
-        </w:rPr>
-        <w:t xml:space="preserve"> </w:t>
-      </w:r>
-      <w:proofErr w:type="spellStart"/>
-      <w:r>
-        <w:rPr>
-          <w:spacing w:val="-2"/>
-        </w:rPr>
-        <w:t>No</w:t>
-      </w:r>
-      <w:proofErr w:type="spellEnd"/>
-      <w:r>
-        <w:rPr>
-          <w:spacing w:val="-2"/>
-        </w:rPr>
-        <w:t>. 17 від 14.04.2023 р. Копія сертифіката додається.</w:t>
+        <w:t>міжнародного стажування виконано в повному обсязі. Отримано Certificate No. 17 від 14.04.2023 р. Копія сертифіката додається.</w:t>
       </w:r>
     </w:p>
     <w:p>
@@ -1714,217 +1202,7 @@
         <w:rPr>
           <w:spacing w:val="-2"/>
         </w:rPr>
-        <w:t xml:space="preserve">. Здобувач підтвердив володіння англійською мовою на рівні B2 міжнародним сертифікатом </w:t>
-      </w:r>
-      <w:proofErr w:type="spellStart"/>
-      <w:r>
-        <w:rPr>
-          <w:spacing w:val="-2"/>
-        </w:rPr>
-        <w:t>Pearson</w:t>
-      </w:r>
-      <w:proofErr w:type="spellEnd"/>
-      <w:r>
-        <w:rPr>
-          <w:spacing w:val="-2"/>
-        </w:rPr>
-        <w:t xml:space="preserve"> </w:t>
-      </w:r>
-      <w:proofErr w:type="spellStart"/>
-      <w:r>
-        <w:rPr>
-          <w:spacing w:val="-2"/>
-        </w:rPr>
-        <w:t>Edexcel</w:t>
-      </w:r>
-      <w:proofErr w:type="spellEnd"/>
-      <w:r>
-        <w:rPr>
-          <w:spacing w:val="-2"/>
-        </w:rPr>
-        <w:t xml:space="preserve"> </w:t>
-      </w:r>
-      <w:proofErr w:type="spellStart"/>
-      <w:r>
-        <w:rPr>
-          <w:spacing w:val="-2"/>
-        </w:rPr>
-        <w:t>Level</w:t>
-      </w:r>
-      <w:proofErr w:type="spellEnd"/>
-      <w:r>
-        <w:rPr>
-          <w:spacing w:val="-2"/>
-        </w:rPr>
-        <w:t xml:space="preserve"> I </w:t>
-      </w:r>
-      <w:proofErr w:type="spellStart"/>
-      <w:r>
-        <w:rPr>
-          <w:spacing w:val="-2"/>
-        </w:rPr>
-        <w:t>Certificate</w:t>
-      </w:r>
-      <w:proofErr w:type="spellEnd"/>
-      <w:r>
-        <w:rPr>
-          <w:spacing w:val="-2"/>
-        </w:rPr>
-        <w:t xml:space="preserve"> </w:t>
-      </w:r>
-      <w:proofErr w:type="spellStart"/>
-      <w:r>
-        <w:rPr>
-          <w:spacing w:val="-2"/>
-        </w:rPr>
-        <w:t>in</w:t>
-      </w:r>
-      <w:proofErr w:type="spellEnd"/>
-      <w:r>
-        <w:rPr>
-          <w:spacing w:val="-2"/>
-        </w:rPr>
-        <w:t xml:space="preserve"> ESOL </w:t>
-      </w:r>
-      <w:proofErr w:type="spellStart"/>
-      <w:r>
-        <w:rPr>
-          <w:spacing w:val="-2"/>
-        </w:rPr>
-        <w:t>International</w:t>
-      </w:r>
-      <w:proofErr w:type="spellEnd"/>
-      <w:r>
-        <w:rPr>
-          <w:spacing w:val="-2"/>
-        </w:rPr>
-        <w:t xml:space="preserve"> (CEF B2), </w:t>
-      </w:r>
-      <w:proofErr w:type="spellStart"/>
-      <w:r>
-        <w:rPr>
-          <w:spacing w:val="-2"/>
-        </w:rPr>
-        <w:t>Pearson</w:t>
-      </w:r>
-      <w:proofErr w:type="spellEnd"/>
-      <w:r>
-        <w:rPr>
-          <w:spacing w:val="-2"/>
-        </w:rPr>
-        <w:t xml:space="preserve"> </w:t>
-      </w:r>
-      <w:proofErr w:type="spellStart"/>
-      <w:r>
-        <w:rPr>
-          <w:spacing w:val="-2"/>
-        </w:rPr>
-        <w:t>Test</w:t>
-      </w:r>
-      <w:proofErr w:type="spellEnd"/>
-      <w:r>
-        <w:rPr>
-          <w:spacing w:val="-2"/>
-        </w:rPr>
-        <w:t xml:space="preserve"> </w:t>
-      </w:r>
-      <w:proofErr w:type="spellStart"/>
-      <w:r>
-        <w:rPr>
-          <w:spacing w:val="-2"/>
-        </w:rPr>
-        <w:t>of</w:t>
-      </w:r>
-      <w:proofErr w:type="spellEnd"/>
-      <w:r>
-        <w:rPr>
-          <w:spacing w:val="-2"/>
-        </w:rPr>
-        <w:t xml:space="preserve"> </w:t>
-      </w:r>
-      <w:proofErr w:type="spellStart"/>
-      <w:r>
-        <w:rPr>
-          <w:spacing w:val="-2"/>
-        </w:rPr>
-        <w:t>English</w:t>
-      </w:r>
-      <w:proofErr w:type="spellEnd"/>
-      <w:r>
-        <w:rPr>
-          <w:spacing w:val="-2"/>
-        </w:rPr>
-        <w:t xml:space="preserve"> </w:t>
-      </w:r>
-      <w:proofErr w:type="spellStart"/>
-      <w:r>
-        <w:rPr>
-          <w:spacing w:val="-2"/>
-        </w:rPr>
-        <w:t>General</w:t>
-      </w:r>
-      <w:proofErr w:type="spellEnd"/>
-      <w:r>
-        <w:rPr>
-          <w:spacing w:val="-2"/>
-        </w:rPr>
-        <w:t xml:space="preserve"> (CEF B2), результат – PASS (WITH MERIT), червень 2020 року; сертифікат видано 05.08.2020 р. Копія сертифіката додається. Здобувач також опублікував 22 наукові праці у наукових періодичних виданнях, які включені до наукометричних баз </w:t>
-      </w:r>
-      <w:proofErr w:type="spellStart"/>
-      <w:r>
-        <w:rPr>
-          <w:spacing w:val="-2"/>
-        </w:rPr>
-        <w:t>Scopus</w:t>
-      </w:r>
-      <w:proofErr w:type="spellEnd"/>
-      <w:r>
-        <w:rPr>
-          <w:spacing w:val="-2"/>
-        </w:rPr>
-        <w:t xml:space="preserve"> та/або </w:t>
-      </w:r>
-      <w:proofErr w:type="spellStart"/>
-      <w:r>
-        <w:rPr>
-          <w:spacing w:val="-2"/>
-        </w:rPr>
-        <w:t>Web</w:t>
-      </w:r>
-      <w:proofErr w:type="spellEnd"/>
-      <w:r>
-        <w:rPr>
-          <w:spacing w:val="-2"/>
-        </w:rPr>
-        <w:t xml:space="preserve"> </w:t>
-      </w:r>
-      <w:proofErr w:type="spellStart"/>
-      <w:r>
-        <w:rPr>
-          <w:spacing w:val="-2"/>
-        </w:rPr>
-        <w:t>of</w:t>
-      </w:r>
-      <w:proofErr w:type="spellEnd"/>
-      <w:r>
-        <w:rPr>
-          <w:spacing w:val="-2"/>
-        </w:rPr>
-        <w:t xml:space="preserve"> </w:t>
-      </w:r>
-      <w:proofErr w:type="spellStart"/>
-      <w:r>
-        <w:rPr>
-          <w:spacing w:val="-2"/>
-        </w:rPr>
-        <w:t>Science</w:t>
-      </w:r>
-      <w:proofErr w:type="spellEnd"/>
-      <w:r>
-        <w:rPr>
-          <w:spacing w:val="-2"/>
-        </w:rPr>
-        <w:t xml:space="preserve"> і мають </w:t>
+        <w:t xml:space="preserve">. Здобувач підтвердив володіння англійською мовою на рівні B2 міжнародним сертифікатом Pearson Edexcel Level I Certificate in ESOL International (CEF B2), Pearson Test of English General (CEF B2), результат – PASS (WITH MERIT), червень 2020 року; сертифікат видано 05.08.2020 р. Копія сертифіката додається. Здобувач також опублікував 22 наукові праці у наукових періодичних виданнях, які включені до наукометричних баз Scopus та/або Web of Science і мають </w:t>
       </w:r>
       <w:r>
         <w:rPr>
@@ -1989,63 +1267,7 @@
         <w:rPr>
           <w:spacing w:val="-2"/>
         </w:rPr>
-        <w:t xml:space="preserve">, 34 публікації за матеріалами конференцій та 2 розділи у наукових виданнях за матеріалами конференцій; також має 10 навчально-методичних праць. Окремо до списку включено 9 свідоцтв про реєстрацію авторського права на твір. Загалом список містить 90 позицій. До окремого списку публікацій англійською мовою у періодичних виданнях, індексованих у </w:t>
-      </w:r>
-      <w:proofErr w:type="spellStart"/>
-      <w:r>
-        <w:rPr>
-          <w:spacing w:val="-2"/>
-        </w:rPr>
-        <w:t>Scopus</w:t>
-      </w:r>
-      <w:proofErr w:type="spellEnd"/>
-      <w:r>
-        <w:rPr>
-          <w:spacing w:val="-2"/>
-        </w:rPr>
-        <w:t xml:space="preserve"> та/або </w:t>
-      </w:r>
-      <w:proofErr w:type="spellStart"/>
-      <w:r>
-        <w:rPr>
-          <w:spacing w:val="-2"/>
-        </w:rPr>
-        <w:t>Web</w:t>
-      </w:r>
-      <w:proofErr w:type="spellEnd"/>
-      <w:r>
-        <w:rPr>
-          <w:spacing w:val="-2"/>
-        </w:rPr>
-        <w:t xml:space="preserve"> </w:t>
-      </w:r>
-      <w:proofErr w:type="spellStart"/>
-      <w:r>
-        <w:rPr>
-          <w:spacing w:val="-2"/>
-        </w:rPr>
-        <w:t>of</w:t>
-      </w:r>
-      <w:proofErr w:type="spellEnd"/>
-      <w:r>
-        <w:rPr>
-          <w:spacing w:val="-2"/>
-        </w:rPr>
-        <w:t xml:space="preserve"> </w:t>
-      </w:r>
-      <w:proofErr w:type="spellStart"/>
-      <w:r>
-        <w:rPr>
-          <w:spacing w:val="-2"/>
-        </w:rPr>
-        <w:t>Science</w:t>
-      </w:r>
-      <w:proofErr w:type="spellEnd"/>
-      <w:r>
-        <w:rPr>
-          <w:spacing w:val="-2"/>
-        </w:rPr>
-        <w:t xml:space="preserve"> із зазначенням номера ISSN, включено 22 статті</w:t>
+        <w:t>, 34 публікації за матеріалами конференцій та 2 розділи у наукових виданнях за матеріалами конференцій; також має 10 навчально-методичних праць. Окремо до списку включено 9 свідоцтв про реєстрацію авторського права на твір. Загалом список містить 90 позицій. До окремого списку публікацій англійською мовою у періодичних виданнях, індексованих у Scopus та/або Web of Science із зазначенням номера ISSN, включено 22 статті</w:t>
       </w:r>
       <w:r>
         <w:rPr>
@@ -2076,63 +1298,7 @@
         <w:rPr>
           <w:spacing w:val="-2"/>
         </w:rPr>
-        <w:t xml:space="preserve">, 25 публікацій за матеріалами конференцій і 2 розділи у наукових виданнях за матеріалами конференцій, та 8 навчально-методичних праць. Із 22 статей, наведених в окремому списку публікацій у періодичних виданнях, індексованих у </w:t>
-      </w:r>
-      <w:proofErr w:type="spellStart"/>
-      <w:r>
-        <w:rPr>
-          <w:spacing w:val="-2"/>
-        </w:rPr>
-        <w:t>Scopus</w:t>
-      </w:r>
-      <w:proofErr w:type="spellEnd"/>
-      <w:r>
-        <w:rPr>
-          <w:spacing w:val="-2"/>
-        </w:rPr>
-        <w:t xml:space="preserve"> та/або </w:t>
-      </w:r>
-      <w:proofErr w:type="spellStart"/>
-      <w:r>
-        <w:rPr>
-          <w:spacing w:val="-2"/>
-        </w:rPr>
-        <w:t>Web</w:t>
-      </w:r>
-      <w:proofErr w:type="spellEnd"/>
-      <w:r>
-        <w:rPr>
-          <w:spacing w:val="-2"/>
-        </w:rPr>
-        <w:t xml:space="preserve"> </w:t>
-      </w:r>
-      <w:proofErr w:type="spellStart"/>
-      <w:r>
-        <w:rPr>
-          <w:spacing w:val="-2"/>
-        </w:rPr>
-        <w:t>of</w:t>
-      </w:r>
-      <w:proofErr w:type="spellEnd"/>
-      <w:r>
-        <w:rPr>
-          <w:spacing w:val="-2"/>
-        </w:rPr>
-        <w:t xml:space="preserve"> </w:t>
-      </w:r>
-      <w:proofErr w:type="spellStart"/>
-      <w:r>
-        <w:rPr>
-          <w:spacing w:val="-2"/>
-        </w:rPr>
-        <w:t>Science</w:t>
-      </w:r>
-      <w:proofErr w:type="spellEnd"/>
-      <w:r>
-        <w:rPr>
-          <w:spacing w:val="-2"/>
-        </w:rPr>
-        <w:t xml:space="preserve"> із зазначенням номера ISSN, 20 опубліковано після захисту дисертації</w:t>
+        <w:t>, 25 публікацій за матеріалами конференцій і 2 розділи у наукових виданнях за матеріалами конференцій, та 8 навчально-методичних праць. Із 22 статей, наведених в окремому списку публікацій у періодичних виданнях, індексованих у Scopus та/або Web of Science із зазначенням номера ISSN, 20 опубліковано після захисту дисертації</w:t>
       </w:r>
       <w:r>
         <w:rPr>
@@ -2255,495 +1421,33 @@
         <w:rPr>
           <w:spacing w:val="-2"/>
         </w:rPr>
-        <w:t xml:space="preserve">1. 2nd </w:t>
-      </w:r>
-      <w:proofErr w:type="spellStart"/>
-      <w:r>
-        <w:rPr>
-          <w:spacing w:val="-2"/>
-        </w:rPr>
-        <w:t>International</w:t>
-      </w:r>
-      <w:proofErr w:type="spellEnd"/>
-      <w:r>
-        <w:rPr>
-          <w:spacing w:val="-2"/>
-        </w:rPr>
-        <w:t xml:space="preserve"> </w:t>
-      </w:r>
-      <w:proofErr w:type="spellStart"/>
-      <w:r>
-        <w:rPr>
-          <w:spacing w:val="-2"/>
-        </w:rPr>
-        <w:t>Workshop</w:t>
-      </w:r>
-      <w:proofErr w:type="spellEnd"/>
-      <w:r>
-        <w:rPr>
-          <w:spacing w:val="-2"/>
-        </w:rPr>
-        <w:t xml:space="preserve"> </w:t>
-      </w:r>
-      <w:proofErr w:type="spellStart"/>
-      <w:r>
-        <w:rPr>
-          <w:spacing w:val="-2"/>
-        </w:rPr>
-        <w:t>on</w:t>
-      </w:r>
-      <w:proofErr w:type="spellEnd"/>
-      <w:r>
-        <w:rPr>
-          <w:spacing w:val="-2"/>
-        </w:rPr>
-        <w:t xml:space="preserve"> </w:t>
-      </w:r>
-      <w:proofErr w:type="spellStart"/>
-      <w:r>
-        <w:rPr>
-          <w:spacing w:val="-2"/>
-        </w:rPr>
-        <w:t>Advanced</w:t>
-      </w:r>
-      <w:proofErr w:type="spellEnd"/>
-      <w:r>
-        <w:rPr>
-          <w:spacing w:val="-2"/>
-        </w:rPr>
-        <w:t xml:space="preserve"> </w:t>
-      </w:r>
-      <w:proofErr w:type="spellStart"/>
-      <w:r>
-        <w:rPr>
-          <w:spacing w:val="-2"/>
-        </w:rPr>
-        <w:t>Applied</w:t>
-      </w:r>
-      <w:proofErr w:type="spellEnd"/>
-      <w:r>
-        <w:rPr>
-          <w:spacing w:val="-2"/>
-        </w:rPr>
-        <w:t xml:space="preserve"> </w:t>
-      </w:r>
-      <w:proofErr w:type="spellStart"/>
-      <w:r>
-        <w:rPr>
-          <w:spacing w:val="-2"/>
-        </w:rPr>
-        <w:t>Information</w:t>
-      </w:r>
-      <w:proofErr w:type="spellEnd"/>
-      <w:r>
-        <w:rPr>
-          <w:spacing w:val="-2"/>
-        </w:rPr>
-        <w:t xml:space="preserve"> Technologies: AI &amp; DSS (AdvAIT-2025), м. Хмельницький (Україна) – м. </w:t>
-      </w:r>
-      <w:proofErr w:type="spellStart"/>
-      <w:r>
-        <w:rPr>
-          <w:spacing w:val="-2"/>
-        </w:rPr>
-        <w:t>Жиліна</w:t>
-      </w:r>
-      <w:proofErr w:type="spellEnd"/>
-      <w:r>
-        <w:rPr>
-          <w:spacing w:val="-2"/>
-        </w:rPr>
-        <w:t xml:space="preserve"> (Словацька Республіка), 5 грудня 2025 р.;</w:t>
-      </w:r>
-    </w:p>
-    <w:p>
-      <w:pPr>
-        <w:rPr>
-          <w:spacing w:val="-2"/>
-        </w:rPr>
-      </w:pPr>
-      <w:r>
-        <w:rPr>
-          <w:spacing w:val="-2"/>
-        </w:rPr>
-        <w:t xml:space="preserve">2. XXIII </w:t>
-      </w:r>
-      <w:proofErr w:type="spellStart"/>
-      <w:r>
-        <w:rPr>
-          <w:spacing w:val="-2"/>
-        </w:rPr>
-        <w:t>International</w:t>
-      </w:r>
-      <w:proofErr w:type="spellEnd"/>
-      <w:r>
-        <w:rPr>
-          <w:spacing w:val="-2"/>
-        </w:rPr>
-        <w:t xml:space="preserve"> </w:t>
-      </w:r>
-      <w:proofErr w:type="spellStart"/>
-      <w:r>
-        <w:rPr>
-          <w:spacing w:val="-2"/>
-        </w:rPr>
-        <w:t>Scientific</w:t>
-      </w:r>
-      <w:proofErr w:type="spellEnd"/>
-      <w:r>
-        <w:rPr>
-          <w:spacing w:val="-2"/>
-        </w:rPr>
-        <w:t xml:space="preserve"> </w:t>
-      </w:r>
-      <w:proofErr w:type="spellStart"/>
-      <w:r>
-        <w:rPr>
-          <w:spacing w:val="-2"/>
-        </w:rPr>
-        <w:t>and</w:t>
-      </w:r>
-      <w:proofErr w:type="spellEnd"/>
-      <w:r>
-        <w:rPr>
-          <w:spacing w:val="-2"/>
-        </w:rPr>
-        <w:t xml:space="preserve"> </w:t>
-      </w:r>
-      <w:proofErr w:type="spellStart"/>
-      <w:r>
-        <w:rPr>
-          <w:spacing w:val="-2"/>
-        </w:rPr>
-        <w:t>Practical</w:t>
-      </w:r>
-      <w:proofErr w:type="spellEnd"/>
-      <w:r>
-        <w:rPr>
-          <w:spacing w:val="-2"/>
-        </w:rPr>
-        <w:t xml:space="preserve"> </w:t>
-      </w:r>
-      <w:proofErr w:type="spellStart"/>
-      <w:r>
-        <w:rPr>
-          <w:spacing w:val="-2"/>
-        </w:rPr>
-        <w:t>Conference</w:t>
-      </w:r>
-      <w:proofErr w:type="spellEnd"/>
-      <w:r>
-        <w:rPr>
-          <w:spacing w:val="-2"/>
-        </w:rPr>
-        <w:t xml:space="preserve"> «</w:t>
-      </w:r>
-      <w:proofErr w:type="spellStart"/>
-      <w:r>
-        <w:rPr>
-          <w:spacing w:val="-2"/>
-        </w:rPr>
-        <w:t>Mathematical</w:t>
-      </w:r>
-      <w:proofErr w:type="spellEnd"/>
-      <w:r>
-        <w:rPr>
-          <w:spacing w:val="-2"/>
-        </w:rPr>
-        <w:t xml:space="preserve"> </w:t>
-      </w:r>
-      <w:proofErr w:type="spellStart"/>
-      <w:r>
-        <w:rPr>
-          <w:spacing w:val="-2"/>
-        </w:rPr>
-        <w:t>Support</w:t>
-      </w:r>
-      <w:proofErr w:type="spellEnd"/>
-      <w:r>
-        <w:rPr>
-          <w:spacing w:val="-2"/>
-        </w:rPr>
-        <w:t xml:space="preserve"> </w:t>
-      </w:r>
-      <w:proofErr w:type="spellStart"/>
-      <w:r>
-        <w:rPr>
-          <w:spacing w:val="-2"/>
-        </w:rPr>
-        <w:t>and</w:t>
-      </w:r>
-      <w:proofErr w:type="spellEnd"/>
-      <w:r>
-        <w:rPr>
-          <w:spacing w:val="-2"/>
-        </w:rPr>
-        <w:t xml:space="preserve"> </w:t>
-      </w:r>
-      <w:proofErr w:type="spellStart"/>
-      <w:r>
-        <w:rPr>
-          <w:spacing w:val="-2"/>
-        </w:rPr>
-        <w:t>Software</w:t>
-      </w:r>
-      <w:proofErr w:type="spellEnd"/>
-      <w:r>
-        <w:rPr>
-          <w:spacing w:val="-2"/>
-        </w:rPr>
-        <w:t xml:space="preserve"> </w:t>
-      </w:r>
-      <w:proofErr w:type="spellStart"/>
-      <w:r>
-        <w:rPr>
-          <w:spacing w:val="-2"/>
-        </w:rPr>
-        <w:t>for</w:t>
-      </w:r>
-      <w:proofErr w:type="spellEnd"/>
-      <w:r>
-        <w:rPr>
-          <w:spacing w:val="-2"/>
-        </w:rPr>
-        <w:t xml:space="preserve"> </w:t>
-      </w:r>
-      <w:proofErr w:type="spellStart"/>
-      <w:r>
-        <w:rPr>
-          <w:spacing w:val="-2"/>
-        </w:rPr>
-        <w:t>Intelligent</w:t>
-      </w:r>
-      <w:proofErr w:type="spellEnd"/>
-      <w:r>
-        <w:rPr>
-          <w:spacing w:val="-2"/>
-        </w:rPr>
-        <w:t xml:space="preserve"> </w:t>
-      </w:r>
-      <w:proofErr w:type="spellStart"/>
-      <w:r>
-        <w:rPr>
-          <w:spacing w:val="-2"/>
-        </w:rPr>
-        <w:t>Systems</w:t>
-      </w:r>
-      <w:proofErr w:type="spellEnd"/>
-      <w:r>
-        <w:rPr>
-          <w:spacing w:val="-2"/>
-        </w:rPr>
-        <w:t>» (MSSIS-2025), м. Дніпро, Україна, 19–21 листопада 2025 р.;</w:t>
-      </w:r>
-    </w:p>
-    <w:p>
-      <w:pPr>
-        <w:rPr>
-          <w:spacing w:val="-2"/>
-        </w:rPr>
-      </w:pPr>
-      <w:r>
-        <w:rPr>
-          <w:spacing w:val="-2"/>
-        </w:rPr>
-        <w:t xml:space="preserve">3. 1st </w:t>
-      </w:r>
-      <w:proofErr w:type="spellStart"/>
-      <w:r>
-        <w:rPr>
-          <w:spacing w:val="-2"/>
-        </w:rPr>
-        <w:t>Workshop</w:t>
-      </w:r>
-      <w:proofErr w:type="spellEnd"/>
-      <w:r>
-        <w:rPr>
-          <w:spacing w:val="-2"/>
-        </w:rPr>
-        <w:t xml:space="preserve"> </w:t>
-      </w:r>
-      <w:proofErr w:type="spellStart"/>
-      <w:r>
-        <w:rPr>
-          <w:spacing w:val="-2"/>
-        </w:rPr>
-        <w:t>on</w:t>
-      </w:r>
-      <w:proofErr w:type="spellEnd"/>
-      <w:r>
-        <w:rPr>
-          <w:spacing w:val="-2"/>
-        </w:rPr>
-        <w:t xml:space="preserve"> </w:t>
-      </w:r>
-      <w:proofErr w:type="spellStart"/>
-      <w:r>
-        <w:rPr>
-          <w:spacing w:val="-2"/>
-        </w:rPr>
-        <w:t>Advanced</w:t>
-      </w:r>
-      <w:proofErr w:type="spellEnd"/>
-      <w:r>
-        <w:rPr>
-          <w:spacing w:val="-2"/>
-        </w:rPr>
-        <w:t xml:space="preserve"> AI </w:t>
-      </w:r>
-      <w:proofErr w:type="spellStart"/>
-      <w:r>
-        <w:rPr>
-          <w:spacing w:val="-2"/>
-        </w:rPr>
-        <w:t>in</w:t>
-      </w:r>
-      <w:proofErr w:type="spellEnd"/>
-      <w:r>
-        <w:rPr>
-          <w:spacing w:val="-2"/>
-        </w:rPr>
-        <w:t xml:space="preserve"> Explainability </w:t>
-      </w:r>
-      <w:proofErr w:type="spellStart"/>
-      <w:r>
-        <w:rPr>
-          <w:spacing w:val="-2"/>
-        </w:rPr>
-        <w:t>and</w:t>
-      </w:r>
-      <w:proofErr w:type="spellEnd"/>
-      <w:r>
-        <w:rPr>
-          <w:spacing w:val="-2"/>
-        </w:rPr>
-        <w:t xml:space="preserve"> </w:t>
-      </w:r>
-      <w:proofErr w:type="spellStart"/>
-      <w:r>
-        <w:rPr>
-          <w:spacing w:val="-2"/>
-        </w:rPr>
-        <w:t>Ethics</w:t>
-      </w:r>
-      <w:proofErr w:type="spellEnd"/>
-      <w:r>
-        <w:rPr>
-          <w:spacing w:val="-2"/>
-        </w:rPr>
-        <w:t xml:space="preserve"> </w:t>
-      </w:r>
-      <w:proofErr w:type="spellStart"/>
-      <w:r>
-        <w:rPr>
-          <w:spacing w:val="-2"/>
-        </w:rPr>
-        <w:t>for</w:t>
-      </w:r>
-      <w:proofErr w:type="spellEnd"/>
-      <w:r>
-        <w:rPr>
-          <w:spacing w:val="-2"/>
-        </w:rPr>
-        <w:t xml:space="preserve"> </w:t>
-      </w:r>
-      <w:proofErr w:type="spellStart"/>
-      <w:r>
-        <w:rPr>
-          <w:spacing w:val="-2"/>
-        </w:rPr>
-        <w:t>the</w:t>
-      </w:r>
-      <w:proofErr w:type="spellEnd"/>
-      <w:r>
-        <w:rPr>
-          <w:spacing w:val="-2"/>
-        </w:rPr>
-        <w:t xml:space="preserve"> </w:t>
-      </w:r>
-      <w:proofErr w:type="spellStart"/>
-      <w:r>
-        <w:rPr>
-          <w:spacing w:val="-2"/>
-        </w:rPr>
-        <w:t>Sustainable</w:t>
-      </w:r>
-      <w:proofErr w:type="spellEnd"/>
-      <w:r>
-        <w:rPr>
-          <w:spacing w:val="-2"/>
-        </w:rPr>
-        <w:t xml:space="preserve"> </w:t>
-      </w:r>
-      <w:proofErr w:type="spellStart"/>
-      <w:r>
-        <w:rPr>
-          <w:spacing w:val="-2"/>
-        </w:rPr>
-        <w:t>Development</w:t>
-      </w:r>
-      <w:proofErr w:type="spellEnd"/>
-      <w:r>
-        <w:rPr>
-          <w:spacing w:val="-2"/>
-        </w:rPr>
-        <w:t xml:space="preserve"> </w:t>
-      </w:r>
-      <w:proofErr w:type="spellStart"/>
-      <w:r>
-        <w:rPr>
-          <w:spacing w:val="-2"/>
-        </w:rPr>
-        <w:t>Goals</w:t>
-      </w:r>
-      <w:proofErr w:type="spellEnd"/>
-      <w:r>
-        <w:rPr>
-          <w:spacing w:val="-2"/>
-        </w:rPr>
-        <w:t xml:space="preserve"> (ExplAI-2025), м. Хмельницький, Україна, 7 листопада 2025 р. Участь здобувача як редактора збірника та співавтора публікації підтверджено матеріалами CEUR-</w:t>
-      </w:r>
-      <w:proofErr w:type="spellStart"/>
-      <w:r>
-        <w:rPr>
-          <w:spacing w:val="-2"/>
-        </w:rPr>
-        <w:t>Workshop</w:t>
-      </w:r>
-      <w:proofErr w:type="spellEnd"/>
-      <w:r>
-        <w:rPr>
-          <w:spacing w:val="-2"/>
-        </w:rPr>
-        <w:t xml:space="preserve"> </w:t>
-      </w:r>
-      <w:proofErr w:type="spellStart"/>
-      <w:r>
-        <w:rPr>
-          <w:spacing w:val="-2"/>
-        </w:rPr>
-        <w:t>Proceedings</w:t>
-      </w:r>
-      <w:proofErr w:type="spellEnd"/>
-      <w:r>
-        <w:rPr>
-          <w:spacing w:val="-2"/>
-        </w:rPr>
-        <w:t xml:space="preserve">, </w:t>
-      </w:r>
-      <w:proofErr w:type="spellStart"/>
-      <w:r>
-        <w:rPr>
-          <w:spacing w:val="-2"/>
-        </w:rPr>
-        <w:t>Vol</w:t>
-      </w:r>
-      <w:proofErr w:type="spellEnd"/>
-      <w:r>
-        <w:rPr>
-          <w:spacing w:val="-2"/>
-        </w:rPr>
-        <w:t>. 4141.</w:t>
+        <w:t>1. 2nd International Workshop on Advanced Applied Information Technologies: AI &amp; DSS (AdvAIT-2025), м. Хмельницький (Україна) – м. Жиліна (Словацька Республіка), 5 грудня 2025 р.;</w:t>
+      </w:r>
+    </w:p>
+    <w:p>
+      <w:pPr>
+        <w:rPr>
+          <w:spacing w:val="-2"/>
+        </w:rPr>
+      </w:pPr>
+      <w:r>
+        <w:rPr>
+          <w:spacing w:val="-2"/>
+        </w:rPr>
+        <w:t>2. XXIII International Scientific and Practical Conference «Mathematical Support and Software for Intelligent Systems» (MSSIS-2025), м. Дніпро, Україна, 19–21 листопада 2025 р.;</w:t>
+      </w:r>
+    </w:p>
+    <w:p>
+      <w:pPr>
+        <w:rPr>
+          <w:spacing w:val="-2"/>
+        </w:rPr>
+      </w:pPr>
+      <w:r>
+        <w:rPr>
+          <w:spacing w:val="-2"/>
+        </w:rPr>
+        <w:t>3. 1st Workshop on Advanced AI in Explainability and Ethics for the Sustainable Development Goals (ExplAI-2025), м. Хмельницький, Україна, 7 листопада 2025 р. Участь здобувача як редактора збірника та співавтора публікації підтверджено матеріалами CEUR-Workshop Proceedings, Vol. 4141.</w:t>
       </w:r>
     </w:p>
     <w:p>
@@ -2806,95 +1510,56 @@
         <w:rPr>
           <w:spacing w:val="-4"/>
         </w:rPr>
-        <w:t xml:space="preserve"> у </w:t>
-      </w:r>
-      <w:proofErr w:type="spellStart"/>
-      <w:r>
-        <w:rPr>
-          <w:spacing w:val="-4"/>
-        </w:rPr>
-        <w:t>Scopus</w:t>
-      </w:r>
-      <w:proofErr w:type="spellEnd"/>
-      <w:r>
-        <w:rPr>
-          <w:spacing w:val="-4"/>
-        </w:rPr>
-        <w:t xml:space="preserve"> та/або </w:t>
-      </w:r>
-      <w:proofErr w:type="spellStart"/>
-      <w:r>
-        <w:rPr>
-          <w:spacing w:val="-4"/>
-        </w:rPr>
-        <w:t>Web</w:t>
-      </w:r>
-      <w:proofErr w:type="spellEnd"/>
-      <w:r>
-        <w:rPr>
-          <w:spacing w:val="-4"/>
-        </w:rPr>
-        <w:t xml:space="preserve"> </w:t>
-      </w:r>
-      <w:proofErr w:type="spellStart"/>
-      <w:r>
-        <w:rPr>
-          <w:spacing w:val="-4"/>
-        </w:rPr>
-        <w:t>of</w:t>
-      </w:r>
-      <w:proofErr w:type="spellEnd"/>
-      <w:r>
-        <w:rPr>
-          <w:spacing w:val="-4"/>
-        </w:rPr>
-        <w:t xml:space="preserve"> </w:t>
-      </w:r>
-      <w:proofErr w:type="spellStart"/>
-      <w:r>
-        <w:rPr>
-          <w:spacing w:val="-4"/>
-        </w:rPr>
-        <w:t>Science</w:t>
-      </w:r>
-      <w:proofErr w:type="spellEnd"/>
-      <w:r>
-        <w:rPr>
-          <w:spacing w:val="-4"/>
+        <w:t xml:space="preserve"> у Scopus та/або Web of Science.</w:t>
+      </w:r>
+    </w:p>
+    <w:p>
+      <w:pPr>
+        <w:rPr>
+          <w:spacing w:val="-2"/>
+        </w:rPr>
+      </w:pPr>
+      <w:r>
+        <w:rPr>
+          <w:spacing w:val="-2"/>
+        </w:rPr>
+        <w:t>Рекомендовано присвоїти вчене звання доцента Радюку Павлу Михайловичу на засіданні кафедри комп</w:t>
+      </w:r>
+      <w:r>
+        <w:rPr>
+          <w:spacing w:val="-2"/>
+        </w:rPr>
+        <w:t>’</w:t>
+      </w:r>
+      <w:r>
+        <w:rPr>
+          <w:spacing w:val="-2"/>
+        </w:rPr>
+        <w:t>ютерних наук «07» вересня 2026 року, протокол № 3, та на засіданні Вченої ради факультету інформаційних технологій «</w:t>
+      </w:r>
+      <w:r>
+        <w:rPr>
+          <w:spacing w:val="-2"/>
+        </w:rPr>
+        <w:t>___</w:t>
+      </w:r>
+      <w:r>
+        <w:rPr>
+          <w:spacing w:val="-2"/>
+        </w:rPr>
+        <w:t xml:space="preserve">» вересня 2026 року, протокол № </w:t>
+      </w:r>
+      <w:r>
+        <w:rPr>
+          <w:spacing w:val="-2"/>
+        </w:rPr>
+        <w:t>___</w:t>
+      </w:r>
+      <w:r>
+        <w:rPr>
+          <w:spacing w:val="-2"/>
         </w:rPr>
         <w:t>.</w:t>
-      </w:r>
-    </w:p>
-    <w:p>
-      <w:pPr>
-        <w:rPr>
-          <w:spacing w:val="-2"/>
-        </w:rPr>
-      </w:pPr>
-      <w:r>
-        <w:rPr>
-          <w:spacing w:val="-2"/>
-        </w:rPr>
-        <w:t>Рекомендовано присвоїти вчене звання доцента Радюку Павлу Михайловичу на засіданні кафедри комп</w:t>
-      </w:r>
-      <w:r>
-        <w:rPr>
-          <w:spacing w:val="-2"/>
-        </w:rPr>
-        <w:t>’</w:t>
-      </w:r>
-      <w:r>
-        <w:rPr>
-          <w:spacing w:val="-2"/>
-        </w:rPr>
-        <w:t xml:space="preserve">ютерних </w:t>
-      </w:r>
-      <w:r>
-        <w:rPr>
-          <w:spacing w:val="-2"/>
-          <w:highlight w:val="yellow"/>
-        </w:rPr>
-        <w:t>наук «07» вересня 2026 року, протокол № 3, та на засіданні Вченої ради факультету інформаційних технологій «10» вересня 2026 року, протокол № 2.</w:t>
       </w:r>
     </w:p>
     <w:p>

</xml_diff>